<commit_message>
slight modification on kelvin version project plan
</commit_message>
<xml_diff>
--- a/project_plan/unsw-ZZSC9020-Project-Plan-2026 H2 Group A Kelvin.docx
+++ b/project_plan/unsw-ZZSC9020-Project-Plan-2026 H2 Group A Kelvin.docx
@@ -1164,23 +1164,13 @@
           <w:lang w:val="en-HK"/>
         </w:rPr>
       </w:pPr>
-      <w:proofErr w:type="spellStart"/>
       <w:r>
         <w:rPr>
           <w:b/>
           <w:bCs/>
           <w:lang w:val="en-HK"/>
         </w:rPr>
-        <w:t>PatchTST</w:t>
-      </w:r>
-      <w:proofErr w:type="spellEnd"/>
-      <w:r>
-        <w:rPr>
-          <w:b/>
-          <w:bCs/>
-          <w:lang w:val="en-HK"/>
-        </w:rPr>
-        <w:t>:</w:t>
+        <w:t>PatchTST:</w:t>
       </w:r>
       <w:r>
         <w:rPr>
@@ -1250,7 +1240,6 @@
         </w:rPr>
         <w:t>owever, </w:t>
       </w:r>
-      <w:proofErr w:type="spellStart"/>
       <w:r>
         <w:rPr>
           <w:b/>
@@ -1259,12 +1248,17 @@
         </w:rPr>
         <w:t>PatchTST</w:t>
       </w:r>
-      <w:proofErr w:type="spellEnd"/>
       <w:r>
         <w:rPr>
           <w:lang w:val="en-HK"/>
         </w:rPr>
         <w:t> (Nie et al., 2023) successfully regained traction for transformer models by addressing key architectural limitations.</w:t>
+      </w:r>
+      <w:r>
+        <w:rPr>
+          <w:lang w:val="en-HK"/>
+        </w:rPr>
+        <w:t xml:space="preserve"> </w:t>
       </w:r>
     </w:p>
     <w:p>
@@ -1276,19 +1270,11 @@
           <w:lang w:val="en-HK"/>
         </w:rPr>
       </w:pPr>
-      <w:proofErr w:type="spellStart"/>
-      <w:r>
-        <w:rPr>
-          <w:lang w:val="en-HK"/>
-        </w:rPr>
-        <w:t>PatchTST</w:t>
-      </w:r>
-      <w:proofErr w:type="spellEnd"/>
-      <w:r>
-        <w:rPr>
-          <w:lang w:val="en-HK"/>
-        </w:rPr>
-        <w:t xml:space="preserve"> is specifically optimized for time-series data through two major innovations:</w:t>
+      <w:r>
+        <w:rPr>
+          <w:lang w:val="en-HK"/>
+        </w:rPr>
+        <w:t>PatchTST is specifically optimized for time-series data through two major innovations:</w:t>
       </w:r>
     </w:p>
     <w:p>
@@ -1418,35 +1404,7 @@
         <w:rPr>
           <w:lang w:val="en-HK"/>
         </w:rPr>
-        <w:t xml:space="preserve">Beyond these changes, it largely follows the vanilla transformer structure (Vaswani et al., 2017) with minor modifications, such as utilizing </w:t>
-      </w:r>
-      <w:proofErr w:type="spellStart"/>
-      <w:r>
-        <w:rPr>
-          <w:lang w:val="en-HK"/>
-        </w:rPr>
-        <w:t>BatchNorm</w:t>
-      </w:r>
-      <w:proofErr w:type="spellEnd"/>
-      <w:r>
-        <w:rPr>
-          <w:lang w:val="en-HK"/>
-        </w:rPr>
-        <w:t xml:space="preserve"> instead of </w:t>
-      </w:r>
-      <w:proofErr w:type="spellStart"/>
-      <w:r>
-        <w:rPr>
-          <w:lang w:val="en-HK"/>
-        </w:rPr>
-        <w:t>LayerNorm</w:t>
-      </w:r>
-      <w:proofErr w:type="spellEnd"/>
-      <w:r>
-        <w:rPr>
-          <w:lang w:val="en-HK"/>
-        </w:rPr>
-        <w:t>.</w:t>
+        <w:t>Beyond these changes, it largely follows the vanilla transformer structure (Vaswani et al., 2017) with minor modifications, such as utilizing BatchNorm instead of LayerNorm.</w:t>
       </w:r>
     </w:p>
     <w:p>
@@ -1463,16 +1421,93 @@
           <w:lang w:val="en-HK"/>
         </w:rPr>
         <w:lastRenderedPageBreak/>
-        <w:t xml:space="preserve">To rigorously evaluate </w:t>
-      </w:r>
-      <w:proofErr w:type="spellStart"/>
-      <w:r>
-        <w:rPr>
-          <w:lang w:val="en-HK"/>
-        </w:rPr>
-        <w:t>PatchTST</w:t>
-      </w:r>
-      <w:proofErr w:type="spellEnd"/>
+        <w:t>It is important to note that there does not</w:t>
+      </w:r>
+      <w:r>
+        <w:rPr>
+          <w:lang w:val="en-HK"/>
+        </w:rPr>
+        <w:t xml:space="preserve"> yet</w:t>
+      </w:r>
+      <w:r>
+        <w:rPr>
+          <w:lang w:val="en-HK"/>
+        </w:rPr>
+        <w:t xml:space="preserve"> exist a direct comparison in a single literature between PatchTST</w:t>
+      </w:r>
+      <w:r>
+        <w:rPr>
+          <w:lang w:val="en-HK"/>
+        </w:rPr>
+        <w:t xml:space="preserve">, </w:t>
+      </w:r>
+      <w:r>
+        <w:rPr>
+          <w:lang w:val="en-HK"/>
+        </w:rPr>
+        <w:t>classical statistical models</w:t>
+      </w:r>
+      <w:r>
+        <w:rPr>
+          <w:lang w:val="en-HK"/>
+        </w:rPr>
+        <w:t xml:space="preserve"> and other </w:t>
+      </w:r>
+      <w:r>
+        <w:rPr>
+          <w:lang w:val="en-HK"/>
+        </w:rPr>
+        <w:t>kinds of</w:t>
+      </w:r>
+      <w:r>
+        <w:rPr>
+          <w:lang w:val="en-HK"/>
+        </w:rPr>
+        <w:t xml:space="preserve"> deep learning </w:t>
+      </w:r>
+      <w:r>
+        <w:rPr>
+          <w:lang w:val="en-HK"/>
+        </w:rPr>
+        <w:t>models</w:t>
+      </w:r>
+      <w:r>
+        <w:rPr>
+          <w:lang w:val="en-HK"/>
+        </w:rPr>
+        <w:t xml:space="preserve"> </w:t>
+      </w:r>
+      <w:r>
+        <w:rPr>
+          <w:color w:val="EE0000"/>
+          <w:lang w:val="en-HK"/>
+        </w:rPr>
+        <w:t>(verify)</w:t>
+      </w:r>
+      <w:r>
+        <w:rPr>
+          <w:lang w:val="en-HK"/>
+        </w:rPr>
+        <w:t xml:space="preserve">. </w:t>
+      </w:r>
+      <w:r>
+        <w:rPr>
+          <w:lang w:val="en-HK"/>
+        </w:rPr>
+        <w:t xml:space="preserve"> Hence, t</w:t>
+      </w:r>
+      <w:r>
+        <w:rPr>
+          <w:lang w:val="en-HK"/>
+        </w:rPr>
+        <w:t xml:space="preserve">o </w:t>
+      </w:r>
+      <w:r>
+        <w:rPr>
+          <w:lang w:val="en-HK"/>
+        </w:rPr>
+        <w:t>cover this gap</w:t>
+      </w:r>
       <w:r>
         <w:rPr>
           <w:lang w:val="en-HK"/>
@@ -1579,13 +1614,7 @@
           <w:bCs/>
           <w:lang w:val="en-HK"/>
         </w:rPr>
-        <w:t>LSTM (Deep Neural Network):</w:t>
-      </w:r>
-      <w:r>
-        <w:rPr>
-          <w:lang w:val="en-HK"/>
-        </w:rPr>
-        <w:t> Highly </w:t>
+        <w:t>LSTM (</w:t>
       </w:r>
       <w:r>
         <w:rPr>
@@ -1593,41 +1622,35 @@
           <w:bCs/>
           <w:lang w:val="en-HK"/>
         </w:rPr>
+        <w:t>Recurrent</w:t>
+      </w:r>
+      <w:r>
+        <w:rPr>
+          <w:b/>
+          <w:bCs/>
+          <w:lang w:val="en-HK"/>
+        </w:rPr>
+        <w:t xml:space="preserve"> Neural Network):</w:t>
+      </w:r>
+      <w:r>
+        <w:rPr>
+          <w:lang w:val="en-HK"/>
+        </w:rPr>
+        <w:t> Highly </w:t>
+      </w:r>
+      <w:r>
+        <w:rPr>
+          <w:b/>
+          <w:bCs/>
+          <w:lang w:val="en-HK"/>
+        </w:rPr>
         <w:t>popular</w:t>
       </w:r>
       <w:r>
         <w:rPr>
           <w:lang w:val="en-HK"/>
         </w:rPr>
-        <w:t xml:space="preserve"> for </w:t>
-      </w:r>
-      <w:proofErr w:type="spellStart"/>
-      <w:r>
-        <w:rPr>
-          <w:lang w:val="en-HK"/>
-        </w:rPr>
-        <w:t>analyzing</w:t>
-      </w:r>
-      <w:proofErr w:type="spellEnd"/>
-      <w:r>
-        <w:rPr>
-          <w:lang w:val="en-HK"/>
-        </w:rPr>
-        <w:t xml:space="preserve"> sequential data. Its gating mechanisms (Hochreiter &amp; </w:t>
-      </w:r>
-      <w:proofErr w:type="spellStart"/>
-      <w:r>
-        <w:rPr>
-          <w:lang w:val="en-HK"/>
-        </w:rPr>
-        <w:t>Schmidhuber</w:t>
-      </w:r>
-      <w:proofErr w:type="spellEnd"/>
-      <w:r>
-        <w:rPr>
-          <w:lang w:val="en-HK"/>
-        </w:rPr>
-        <w:t xml:space="preserve">, 1997) retain information across longer intervals. However, </w:t>
+        <w:t xml:space="preserve"> for analyzing sequential data. Its gating mechanisms (Hochreiter &amp; Schmidhuber, 1997) retain information across longer intervals. However, </w:t>
       </w:r>
       <w:r>
         <w:rPr>
@@ -1655,7 +1678,19 @@
         <w:rPr>
           <w:lang w:val="en-HK"/>
         </w:rPr>
-        <w:t xml:space="preserve">Because the foundational research comparing these transformer architectures </w:t>
+        <w:t xml:space="preserve">Because the foundational research </w:t>
+      </w:r>
+      <w:r>
+        <w:rPr>
+          <w:lang w:val="en-HK"/>
+        </w:rPr>
+        <w:t>comparisons</w:t>
+      </w:r>
+      <w:r>
+        <w:rPr>
+          <w:lang w:val="en-HK"/>
+        </w:rPr>
+        <w:t xml:space="preserve"> </w:t>
       </w:r>
       <w:r>
         <w:rPr>
@@ -1686,7 +1721,19 @@
         <w:rPr>
           <w:lang w:val="en-HK"/>
         </w:rPr>
-        <w:t>it is beneficial</w:t>
+        <w:t xml:space="preserve">it is </w:t>
+      </w:r>
+      <w:r>
+        <w:rPr>
+          <w:lang w:val="en-HK"/>
+        </w:rPr>
+        <w:t xml:space="preserve">also </w:t>
+      </w:r>
+      <w:r>
+        <w:rPr>
+          <w:lang w:val="en-HK"/>
+        </w:rPr>
+        <w:t>beneficial</w:t>
       </w:r>
       <w:r>
         <w:rPr>
@@ -1704,21 +1751,25 @@
         <w:rPr>
           <w:lang w:val="en-HK"/>
         </w:rPr>
-        <w:t xml:space="preserve">. By evaluating </w:t>
-      </w:r>
-      <w:proofErr w:type="spellStart"/>
-      <w:r>
-        <w:rPr>
-          <w:lang w:val="en-HK"/>
-        </w:rPr>
-        <w:t>PatchTST</w:t>
-      </w:r>
-      <w:proofErr w:type="spellEnd"/>
-      <w:r>
-        <w:rPr>
-          <w:lang w:val="en-HK"/>
-        </w:rPr>
-        <w:t xml:space="preserve"> alongside SARIMAX and LSTM, we will determine if it yields improved predictive performance for this specific domain.</w:t>
+        <w:t xml:space="preserve"> which is </w:t>
+      </w:r>
+      <w:r>
+        <w:rPr>
+          <w:lang w:val="en-HK"/>
+        </w:rPr>
+        <w:t>much more</w:t>
+      </w:r>
+      <w:r>
+        <w:rPr>
+          <w:lang w:val="en-HK"/>
+        </w:rPr>
+        <w:t xml:space="preserve"> relevant to our client</w:t>
+      </w:r>
+      <w:r>
+        <w:rPr>
+          <w:lang w:val="en-HK"/>
+        </w:rPr>
+        <w:t>. By evaluating PatchTST alongside SARIMAX and LSTM, we will determine if it yields improved predictive performance for this specific domain.</w:t>
       </w:r>
     </w:p>
     <w:p>
@@ -1790,16 +1841,8 @@
         <w:rPr>
           <w:lang w:val="en-HK"/>
         </w:rPr>
-        <w:t xml:space="preserve">SARIMAX, LSTM and </w:t>
-      </w:r>
-      <w:proofErr w:type="spellStart"/>
-      <w:r>
-        <w:rPr>
-          <w:lang w:val="en-HK"/>
-        </w:rPr>
-        <w:t>PatchTST</w:t>
-      </w:r>
-      <w:proofErr w:type="spellEnd"/>
+        <w:t>SARIMAX, LSTM and PatchTST</w:t>
+      </w:r>
       <w:r>
         <w:rPr>
           <w:lang w:val="en-HK"/>
@@ -2286,6 +2329,7 @@
           <w:bCs/>
           <w:lang w:val="en-HK"/>
         </w:rPr>
+        <w:lastRenderedPageBreak/>
         <w:t>Evaluation Metrics:</w:t>
       </w:r>
       <w:r>
@@ -2355,7 +2399,6 @@
           <w:bCs/>
           <w:lang w:val="en-HK"/>
         </w:rPr>
-        <w:lastRenderedPageBreak/>
         <w:t>3.4 Software &amp; Tools</w:t>
       </w:r>
       <w:r>
@@ -2385,25 +2428,7 @@
           <w:bCs/>
           <w:lang w:val="en-HK"/>
         </w:rPr>
-        <w:t xml:space="preserve">Google </w:t>
-      </w:r>
-      <w:proofErr w:type="spellStart"/>
-      <w:r>
-        <w:rPr>
-          <w:b/>
-          <w:bCs/>
-          <w:lang w:val="en-HK"/>
-        </w:rPr>
-        <w:t>Colab</w:t>
-      </w:r>
-      <w:proofErr w:type="spellEnd"/>
-      <w:r>
-        <w:rPr>
-          <w:b/>
-          <w:bCs/>
-          <w:lang w:val="en-HK"/>
-        </w:rPr>
-        <w:t xml:space="preserve"> Notebooks</w:t>
+        <w:t>Google Colab Notebooks</w:t>
       </w:r>
       <w:r>
         <w:rPr>
@@ -2448,21 +2473,7 @@
         <w:rPr>
           <w:lang w:val="en-HK"/>
         </w:rPr>
-        <w:t> pandas, </w:t>
-      </w:r>
-      <w:proofErr w:type="spellStart"/>
-      <w:r>
-        <w:rPr>
-          <w:lang w:val="en-HK"/>
-        </w:rPr>
-        <w:t>numpy</w:t>
-      </w:r>
-      <w:proofErr w:type="spellEnd"/>
-      <w:r>
-        <w:rPr>
-          <w:lang w:val="en-HK"/>
-        </w:rPr>
-        <w:t>, matplotlib, scikit-learn.</w:t>
+        <w:t> pandas, numpy, matplotlib, scikit-learn.</w:t>
       </w:r>
     </w:p>
     <w:p>
@@ -2505,35 +2516,7 @@
         <w:rPr>
           <w:lang w:val="en-HK"/>
         </w:rPr>
-        <w:t> </w:t>
-      </w:r>
-      <w:proofErr w:type="spellStart"/>
-      <w:r>
-        <w:rPr>
-          <w:lang w:val="en-HK"/>
-        </w:rPr>
-        <w:t>statsmodels</w:t>
-      </w:r>
-      <w:proofErr w:type="spellEnd"/>
-      <w:r>
-        <w:rPr>
-          <w:lang w:val="en-HK"/>
-        </w:rPr>
-        <w:t> (SARIMAX), </w:t>
-      </w:r>
-      <w:proofErr w:type="spellStart"/>
-      <w:r>
-        <w:rPr>
-          <w:lang w:val="en-HK"/>
-        </w:rPr>
-        <w:t>PyTorch</w:t>
-      </w:r>
-      <w:proofErr w:type="spellEnd"/>
-      <w:r>
-        <w:rPr>
-          <w:lang w:val="en-HK"/>
-        </w:rPr>
-        <w:t> or TensorFlow (LSTM), and open-source repositor</w:t>
+        <w:t> statsmodels (SARIMAX), PyTorch or TensorFlow (LSTM), and open-source repositor</w:t>
       </w:r>
       <w:r>
         <w:rPr>
@@ -2545,21 +2528,7 @@
         <w:rPr>
           <w:lang w:val="en-HK"/>
         </w:rPr>
-        <w:t xml:space="preserve"> for </w:t>
-      </w:r>
-      <w:proofErr w:type="spellStart"/>
-      <w:r>
-        <w:rPr>
-          <w:lang w:val="en-HK"/>
-        </w:rPr>
-        <w:t>PatchTST</w:t>
-      </w:r>
-      <w:proofErr w:type="spellEnd"/>
-      <w:r>
-        <w:rPr>
-          <w:lang w:val="en-HK"/>
-        </w:rPr>
-        <w:t>.</w:t>
+        <w:t xml:space="preserve"> for PatchTST.</w:t>
       </w:r>
     </w:p>
     <w:p>
@@ -2698,7 +2667,7 @@
           <w:noProof/>
         </w:rPr>
         <w:drawing>
-          <wp:inline distT="0" distB="0" distL="0" distR="0" wp14:anchorId="30ED272F" wp14:editId="15788828">
+          <wp:inline distT="0" distB="0" distL="0" distR="0" wp14:anchorId="30ED272F" wp14:editId="0CBF1AE8">
             <wp:extent cx="5943600" cy="2628900"/>
             <wp:effectExtent l="19050" t="19050" r="19050" b="19050"/>
             <wp:docPr id="207323580" name="Picture 2"/>
@@ -3514,29 +3483,7 @@
                 <w:szCs w:val="20"/>
                 <w:lang w:eastAsia="en-HK"/>
               </w:rPr>
-              <w:t xml:space="preserve">, Model lead of </w:t>
-            </w:r>
-            <w:proofErr w:type="spellStart"/>
-            <w:r>
-              <w:rPr>
-                <w:rFonts w:eastAsia="Times New Roman" w:cs="Times New Roman"/>
-                <w:color w:val="000000"/>
-                <w:sz w:val="20"/>
-                <w:szCs w:val="20"/>
-                <w:lang w:eastAsia="en-HK"/>
-              </w:rPr>
-              <w:t>PatchTST</w:t>
-            </w:r>
-            <w:proofErr w:type="spellEnd"/>
-            <w:r>
-              <w:rPr>
-                <w:rFonts w:eastAsia="Times New Roman" w:cs="Times New Roman"/>
-                <w:color w:val="000000"/>
-                <w:sz w:val="20"/>
-                <w:szCs w:val="20"/>
-                <w:lang w:eastAsia="en-HK"/>
-              </w:rPr>
-              <w:t xml:space="preserve"> + Comparison</w:t>
+              <w:t>, Model lead of PatchTST + Comparison</w:t>
             </w:r>
           </w:p>
         </w:tc>
@@ -3687,29 +3634,7 @@
                 <w:szCs w:val="20"/>
                 <w:lang w:eastAsia="en-HK"/>
               </w:rPr>
-              <w:t xml:space="preserve"> and Model lead of </w:t>
-            </w:r>
-            <w:proofErr w:type="spellStart"/>
-            <w:r>
-              <w:rPr>
-                <w:rFonts w:eastAsia="Times New Roman" w:cs="Times New Roman"/>
-                <w:color w:val="000000"/>
-                <w:sz w:val="20"/>
-                <w:szCs w:val="20"/>
-                <w:lang w:eastAsia="en-HK"/>
-              </w:rPr>
-              <w:t>PatchTST</w:t>
-            </w:r>
-            <w:proofErr w:type="spellEnd"/>
-            <w:r>
-              <w:rPr>
-                <w:rFonts w:eastAsia="Times New Roman" w:cs="Times New Roman"/>
-                <w:color w:val="000000"/>
-                <w:sz w:val="20"/>
-                <w:szCs w:val="20"/>
-                <w:lang w:eastAsia="en-HK"/>
-              </w:rPr>
-              <w:t xml:space="preserve"> + Comparison</w:t>
+              <w:t xml:space="preserve"> and Model lead of PatchTST + Comparison</w:t>
             </w:r>
             <w:bookmarkEnd w:id="11"/>
           </w:p>
@@ -3987,15 +3912,7 @@
         <w:spacing w:before="240"/>
       </w:pPr>
       <w:r>
-        <w:t xml:space="preserve">Hochreiter, S. and </w:t>
-      </w:r>
-      <w:proofErr w:type="spellStart"/>
-      <w:r>
-        <w:t>Schmidhuber</w:t>
-      </w:r>
-      <w:proofErr w:type="spellEnd"/>
-      <w:r>
-        <w:t>, J. (1997). “Long Short-Term Memory.” Neural Computation, 9(8), pp. 1735–1780.</w:t>
+        <w:t>Hochreiter, S. and Schmidhuber, J. (1997). “Long Short-Term Memory.” Neural Computation, 9(8), pp. 1735–1780.</w:t>
       </w:r>
     </w:p>
     <w:p>
@@ -4045,31 +3962,7 @@
         <w:spacing w:before="240"/>
       </w:pPr>
       <w:r>
-        <w:t xml:space="preserve">Vaswani, A., </w:t>
-      </w:r>
-      <w:proofErr w:type="spellStart"/>
-      <w:r>
-        <w:t>Shazeer</w:t>
-      </w:r>
-      <w:proofErr w:type="spellEnd"/>
-      <w:r>
-        <w:t xml:space="preserve">, N., Parmar, N., </w:t>
-      </w:r>
-      <w:proofErr w:type="spellStart"/>
-      <w:r>
-        <w:t>Uszkoreit</w:t>
-      </w:r>
-      <w:proofErr w:type="spellEnd"/>
-      <w:r>
-        <w:t xml:space="preserve">, J., Jones, L., Gomez, A. N., Kaiser, Ł., &amp; </w:t>
-      </w:r>
-      <w:proofErr w:type="spellStart"/>
-      <w:r>
-        <w:t>Polosukhin</w:t>
-      </w:r>
-      <w:proofErr w:type="spellEnd"/>
-      <w:r>
-        <w:t>, I. (2017). Attention is all you need. </w:t>
+        <w:t>Vaswani, A., Shazeer, N., Parmar, N., Uszkoreit, J., Jones, L., Gomez, A. N., Kaiser, Ł., &amp; Polosukhin, I. (2017). Attention is all you need. </w:t>
       </w:r>
       <w:r>
         <w:rPr>
@@ -4124,15 +4017,7 @@
         <w:spacing w:before="240"/>
       </w:pPr>
       <w:r>
-        <w:t xml:space="preserve">Zeng, A., Chen, M., Zhang, L., &amp; Xu, Q. (2022). Are transformers effective for time series forecasting? </w:t>
-      </w:r>
-      <w:proofErr w:type="spellStart"/>
-      <w:r>
-        <w:t>arXiv</w:t>
-      </w:r>
-      <w:proofErr w:type="spellEnd"/>
-      <w:r>
-        <w:t xml:space="preserve">. </w:t>
+        <w:t xml:space="preserve">Zeng, A., Chen, M., Zhang, L., &amp; Xu, Q. (2022). Are transformers effective for time series forecasting? arXiv. </w:t>
       </w:r>
       <w:hyperlink r:id="rId14" w:history="1">
         <w:r>
@@ -4281,29 +4166,7 @@
         <w:szCs w:val="18"/>
         <w:lang w:val="en-HK"/>
       </w:rPr>
-      <w:t xml:space="preserve">Due to time constraints, </w:t>
-    </w:r>
-    <w:proofErr w:type="spellStart"/>
-    <w:r>
-      <w:rPr>
-        <w:i/>
-        <w:iCs/>
-        <w:sz w:val="18"/>
-        <w:szCs w:val="18"/>
-        <w:lang w:val="en-HK"/>
-      </w:rPr>
-      <w:t>PatchTST</w:t>
-    </w:r>
-    <w:proofErr w:type="spellEnd"/>
-    <w:r>
-      <w:rPr>
-        <w:i/>
-        <w:iCs/>
-        <w:sz w:val="18"/>
-        <w:szCs w:val="18"/>
-        <w:lang w:val="en-HK"/>
-      </w:rPr>
-      <w:t xml:space="preserve"> will only utilize the supervised training approach, omitting the</w:t>
+      <w:t>Due to time constraints, PatchTST will only utilize the supervised training approach, omitting the</w:t>
     </w:r>
     <w:r>
       <w:rPr>

</xml_diff>

<commit_message>
more modification on kelvin project plan
</commit_message>
<xml_diff>
--- a/project_plan/unsw-ZZSC9020-Project-Plan-2026 H2 Group A Kelvin.docx
+++ b/project_plan/unsw-ZZSC9020-Project-Plan-2026 H2 Group A Kelvin.docx
@@ -1232,7 +1232,13 @@
         <w:rPr>
           <w:lang w:val="en-HK"/>
         </w:rPr>
-        <w:t xml:space="preserve"> H</w:t>
+        <w:t xml:space="preserve"> </w:t>
+      </w:r>
+      <w:r>
+        <w:rPr>
+          <w:lang w:val="en-HK"/>
+        </w:rPr>
+        <w:t>H</w:t>
       </w:r>
       <w:r>
         <w:rPr>
@@ -1252,13 +1258,440 @@
         <w:rPr>
           <w:lang w:val="en-HK"/>
         </w:rPr>
-        <w:t> (Nie et al., 2023) successfully regained traction for transformer models by addressing key architectural limitations.</w:t>
+        <w:t xml:space="preserve"> (Nie et al., 2023) successfully regained traction for transformer models by addressing </w:t>
+      </w:r>
+      <w:r>
+        <w:rPr>
+          <w:lang w:val="en-HK"/>
+        </w:rPr>
+        <w:t>several issues prevalent in older transformer</w:t>
+      </w:r>
+      <w:r>
+        <w:rPr>
+          <w:lang w:val="en-HK"/>
+        </w:rPr>
+        <w:t>s</w:t>
+      </w:r>
+      <w:r>
+        <w:rPr>
+          <w:lang w:val="en-HK"/>
+        </w:rPr>
+        <w:t>.</w:t>
       </w:r>
       <w:r>
         <w:rPr>
           <w:lang w:val="en-HK"/>
         </w:rPr>
         <w:t xml:space="preserve"> </w:t>
+      </w:r>
+      <w:r>
+        <w:rPr>
+          <w:lang w:val="en-HK"/>
+        </w:rPr>
+        <w:t>However, w</w:t>
+      </w:r>
+      <w:r>
+        <w:rPr>
+          <w:lang w:val="en-HK"/>
+        </w:rPr>
+        <w:t xml:space="preserve">e </w:t>
+      </w:r>
+      <w:r>
+        <w:rPr>
+          <w:lang w:val="en-HK"/>
+        </w:rPr>
+        <w:t>note that the authors</w:t>
+      </w:r>
+      <w:r>
+        <w:rPr>
+          <w:lang w:val="en-HK"/>
+        </w:rPr>
+        <w:t xml:space="preserve"> only</w:t>
+      </w:r>
+      <w:r>
+        <w:rPr>
+          <w:lang w:val="en-HK"/>
+        </w:rPr>
+        <w:t xml:space="preserve"> benchmarked DLinear from (Zeng et al., 2022) but not any </w:t>
+      </w:r>
+      <w:r>
+        <w:rPr>
+          <w:lang w:val="en-HK"/>
+        </w:rPr>
+        <w:t xml:space="preserve">of the </w:t>
+      </w:r>
+      <w:r>
+        <w:rPr>
+          <w:lang w:val="en-HK"/>
+        </w:rPr>
+        <w:t>classical statistical models</w:t>
+      </w:r>
+      <w:r>
+        <w:rPr>
+          <w:lang w:val="en-HK"/>
+        </w:rPr>
+        <w:t xml:space="preserve"> mentioned in (Li et al., 2022)</w:t>
+      </w:r>
+      <w:r>
+        <w:rPr>
+          <w:lang w:val="en-HK"/>
+        </w:rPr>
+        <w:t>.</w:t>
+      </w:r>
+      <w:r>
+        <w:rPr>
+          <w:lang w:val="en-HK"/>
+        </w:rPr>
+        <w:t xml:space="preserve"> </w:t>
+      </w:r>
+      <w:r>
+        <w:rPr>
+          <w:lang w:val="en-HK"/>
+        </w:rPr>
+        <w:t>That said</w:t>
+      </w:r>
+      <w:r>
+        <w:rPr>
+          <w:lang w:val="en-HK"/>
+        </w:rPr>
+        <w:t xml:space="preserve">, it </w:t>
+      </w:r>
+      <w:r>
+        <w:rPr>
+          <w:lang w:val="en-HK"/>
+        </w:rPr>
+        <w:t>would be natural</w:t>
+      </w:r>
+      <w:r>
+        <w:rPr>
+          <w:lang w:val="en-HK"/>
+        </w:rPr>
+        <w:t xml:space="preserve"> to</w:t>
+      </w:r>
+      <w:r>
+        <w:rPr>
+          <w:lang w:val="en-HK"/>
+        </w:rPr>
+        <w:t xml:space="preserve"> also</w:t>
+      </w:r>
+      <w:r>
+        <w:rPr>
+          <w:lang w:val="en-HK"/>
+        </w:rPr>
+        <w:t xml:space="preserve"> incorporate a </w:t>
+      </w:r>
+      <w:r>
+        <w:rPr>
+          <w:lang w:val="en-HK"/>
+        </w:rPr>
+        <w:t>closer</w:t>
+      </w:r>
+      <w:r>
+        <w:rPr>
+          <w:lang w:val="en-HK"/>
+        </w:rPr>
+        <w:t xml:space="preserve"> predecessor </w:t>
+      </w:r>
+      <w:r>
+        <w:rPr>
+          <w:lang w:val="en-HK"/>
+        </w:rPr>
+        <w:t>to</w:t>
+      </w:r>
+      <w:r>
+        <w:rPr>
+          <w:lang w:val="en-HK"/>
+        </w:rPr>
+        <w:t xml:space="preserve"> the transformer</w:t>
+      </w:r>
+      <w:r>
+        <w:rPr>
+          <w:lang w:val="en-HK"/>
+        </w:rPr>
+        <w:t xml:space="preserve"> for comparison</w:t>
+      </w:r>
+      <w:r>
+        <w:rPr>
+          <w:lang w:val="en-HK"/>
+        </w:rPr>
+        <w:t xml:space="preserve"> - </w:t>
+      </w:r>
+      <w:r>
+        <w:rPr>
+          <w:lang w:val="en-HK"/>
+        </w:rPr>
+        <w:t>the LSTM</w:t>
+      </w:r>
+      <w:r>
+        <w:rPr>
+          <w:lang w:val="en-HK"/>
+        </w:rPr>
+        <w:t xml:space="preserve"> </w:t>
+      </w:r>
+      <w:r>
+        <w:rPr>
+          <w:color w:val="EE0000"/>
+          <w:lang w:val="en-HK"/>
+        </w:rPr>
+        <w:t>(</w:t>
+      </w:r>
+      <w:r>
+        <w:rPr>
+          <w:color w:val="EE0000"/>
+          <w:lang w:val="en-HK"/>
+        </w:rPr>
+        <w:t xml:space="preserve">Table 1 in </w:t>
+      </w:r>
+      <w:r>
+        <w:rPr>
+          <w:color w:val="EE0000"/>
+          <w:lang w:val="en-HK"/>
+        </w:rPr>
+        <w:t>Kong et al., 2025)</w:t>
+      </w:r>
+      <w:r>
+        <w:rPr>
+          <w:lang w:val="en-HK"/>
+        </w:rPr>
+        <w:t>.</w:t>
+      </w:r>
+    </w:p>
+    <w:p>
+      <w:pPr>
+        <w:pStyle w:val="BodyText"/>
+        <w:spacing w:after="0"/>
+        <w:ind w:rightChars="-116" w:right="-278"/>
+        <w:rPr>
+          <w:lang w:val="en-HK"/>
+        </w:rPr>
+      </w:pPr>
+      <w:r>
+        <w:rPr>
+          <w:lang w:val="en-HK"/>
+        </w:rPr>
+        <w:t>Hence, t</w:t>
+      </w:r>
+      <w:r>
+        <w:rPr>
+          <w:lang w:val="en-HK"/>
+        </w:rPr>
+        <w:t xml:space="preserve">o </w:t>
+      </w:r>
+      <w:r>
+        <w:rPr>
+          <w:lang w:val="en-HK"/>
+        </w:rPr>
+        <w:t>cover th</w:t>
+      </w:r>
+      <w:r>
+        <w:rPr>
+          <w:lang w:val="en-HK"/>
+        </w:rPr>
+        <w:t>ese</w:t>
+      </w:r>
+      <w:r>
+        <w:rPr>
+          <w:lang w:val="en-HK"/>
+        </w:rPr>
+        <w:t xml:space="preserve"> gap</w:t>
+      </w:r>
+      <w:r>
+        <w:rPr>
+          <w:lang w:val="en-HK"/>
+        </w:rPr>
+        <w:t>s</w:t>
+      </w:r>
+      <w:r>
+        <w:rPr>
+          <w:lang w:val="en-HK"/>
+        </w:rPr>
+        <w:t xml:space="preserve">, we will benchmark it against </w:t>
+      </w:r>
+      <w:r>
+        <w:rPr>
+          <w:lang w:val="en-HK"/>
+        </w:rPr>
+        <w:t xml:space="preserve">the following </w:t>
+      </w:r>
+      <w:r>
+        <w:rPr>
+          <w:lang w:val="en-HK"/>
+        </w:rPr>
+        <w:t>models:</w:t>
+      </w:r>
+    </w:p>
+    <w:p>
+      <w:pPr>
+        <w:pStyle w:val="BodyText"/>
+        <w:numPr>
+          <w:ilvl w:val="0"/>
+          <w:numId w:val="23"/>
+        </w:numPr>
+        <w:spacing w:before="0" w:after="0"/>
+        <w:ind w:rightChars="-116" w:right="-278"/>
+        <w:rPr>
+          <w:lang w:val="en-HK"/>
+        </w:rPr>
+      </w:pPr>
+      <w:r>
+        <w:rPr>
+          <w:b/>
+          <w:bCs/>
+          <w:color w:val="EE0000"/>
+          <w:lang w:val="en-HK"/>
+        </w:rPr>
+        <w:t>SARIMAX (Classical Statistical)</w:t>
+      </w:r>
+      <w:r>
+        <w:rPr>
+          <w:b/>
+          <w:bCs/>
+          <w:color w:val="EE0000"/>
+          <w:lang w:val="en-HK"/>
+        </w:rPr>
+        <w:t xml:space="preserve"> </w:t>
+      </w:r>
+      <w:r>
+        <w:rPr>
+          <w:b/>
+          <w:bCs/>
+          <w:color w:val="EE0000"/>
+          <w:lang w:val="en-HK"/>
+        </w:rPr>
+        <w:t>can also consider</w:t>
+      </w:r>
+      <w:r>
+        <w:rPr>
+          <w:b/>
+          <w:bCs/>
+          <w:color w:val="EE0000"/>
+          <w:lang w:val="en-HK"/>
+        </w:rPr>
+        <w:t xml:space="preserve"> one of the two classical models from (Li et al., 2022)</w:t>
+      </w:r>
+      <w:r>
+        <w:rPr>
+          <w:b/>
+          <w:bCs/>
+          <w:color w:val="EE0000"/>
+          <w:lang w:val="en-HK"/>
+        </w:rPr>
+        <w:t>. Informer model already benchmarked ARIMA</w:t>
+      </w:r>
+      <w:r>
+        <w:rPr>
+          <w:b/>
+          <w:bCs/>
+          <w:color w:val="EE0000"/>
+          <w:lang w:val="en-HK"/>
+        </w:rPr>
+        <w:t>:</w:t>
+      </w:r>
+      <w:r>
+        <w:rPr>
+          <w:color w:val="EE0000"/>
+          <w:lang w:val="en-HK"/>
+        </w:rPr>
+        <w:t> </w:t>
+      </w:r>
+      <w:r>
+        <w:rPr>
+          <w:lang w:val="en-HK"/>
+        </w:rPr>
+        <w:t>Historically relied upon for its </w:t>
+      </w:r>
+      <w:r>
+        <w:rPr>
+          <w:b/>
+          <w:bCs/>
+          <w:lang w:val="en-HK"/>
+        </w:rPr>
+        <w:t>interpretable</w:t>
+      </w:r>
+      <w:r>
+        <w:rPr>
+          <w:lang w:val="en-HK"/>
+        </w:rPr>
+        <w:t xml:space="preserve"> and highly effective modelling of trends and seasonality (Box et al., 2015). It allows for external explanatory variables (e.g., </w:t>
+      </w:r>
+      <w:r>
+        <w:rPr>
+          <w:lang w:val="en-HK"/>
+        </w:rPr>
+        <w:lastRenderedPageBreak/>
+        <w:t>weather) but inherently struggles with </w:t>
+      </w:r>
+      <w:r>
+        <w:rPr>
+          <w:b/>
+          <w:bCs/>
+          <w:lang w:val="en-HK"/>
+        </w:rPr>
+        <w:t>nonlinear</w:t>
+      </w:r>
+      <w:r>
+        <w:rPr>
+          <w:lang w:val="en-HK"/>
+        </w:rPr>
+        <w:t> relationships and long-range temporal dependencies.</w:t>
+      </w:r>
+    </w:p>
+    <w:p>
+      <w:pPr>
+        <w:pStyle w:val="BodyText"/>
+        <w:numPr>
+          <w:ilvl w:val="0"/>
+          <w:numId w:val="23"/>
+        </w:numPr>
+        <w:spacing w:before="0" w:after="0"/>
+        <w:ind w:rightChars="-116" w:right="-278"/>
+        <w:rPr>
+          <w:lang w:val="en-HK"/>
+        </w:rPr>
+      </w:pPr>
+      <w:r>
+        <w:rPr>
+          <w:b/>
+          <w:bCs/>
+          <w:lang w:val="en-HK"/>
+        </w:rPr>
+        <w:t>LSTM (</w:t>
+      </w:r>
+      <w:r>
+        <w:rPr>
+          <w:b/>
+          <w:bCs/>
+          <w:lang w:val="en-HK"/>
+        </w:rPr>
+        <w:t>Recurrent</w:t>
+      </w:r>
+      <w:r>
+        <w:rPr>
+          <w:b/>
+          <w:bCs/>
+          <w:lang w:val="en-HK"/>
+        </w:rPr>
+        <w:t xml:space="preserve"> Neural Network):</w:t>
+      </w:r>
+      <w:r>
+        <w:rPr>
+          <w:lang w:val="en-HK"/>
+        </w:rPr>
+        <w:t> Highly </w:t>
+      </w:r>
+      <w:r>
+        <w:rPr>
+          <w:b/>
+          <w:bCs/>
+          <w:lang w:val="en-HK"/>
+        </w:rPr>
+        <w:t>popular</w:t>
+      </w:r>
+      <w:r>
+        <w:rPr>
+          <w:lang w:val="en-HK"/>
+        </w:rPr>
+        <w:t> for analyzing sequential data. Its gating mechanisms (Hochreiter &amp; Schmidhuber, 1997) retain information across longer intervals. However, it is strictly sequential processing limits its ability to efficiently capture complex, long-range dependencies compared to transformers.</w:t>
       </w:r>
     </w:p>
     <w:p>
@@ -1405,264 +1838,6 @@
           <w:lang w:val="en-HK"/>
         </w:rPr>
         <w:t>Beyond these changes, it largely follows the vanilla transformer structure (Vaswani et al., 2017) with minor modifications, such as utilizing BatchNorm instead of LayerNorm.</w:t>
-      </w:r>
-    </w:p>
-    <w:p>
-      <w:pPr>
-        <w:pStyle w:val="BodyText"/>
-        <w:spacing w:after="0"/>
-        <w:ind w:rightChars="-116" w:right="-278"/>
-        <w:rPr>
-          <w:lang w:val="en-HK"/>
-        </w:rPr>
-      </w:pPr>
-      <w:r>
-        <w:rPr>
-          <w:lang w:val="en-HK"/>
-        </w:rPr>
-        <w:lastRenderedPageBreak/>
-        <w:t>It is important to note that there does not</w:t>
-      </w:r>
-      <w:r>
-        <w:rPr>
-          <w:lang w:val="en-HK"/>
-        </w:rPr>
-        <w:t xml:space="preserve"> yet</w:t>
-      </w:r>
-      <w:r>
-        <w:rPr>
-          <w:lang w:val="en-HK"/>
-        </w:rPr>
-        <w:t xml:space="preserve"> exist a direct comparison in a single literature between PatchTST</w:t>
-      </w:r>
-      <w:r>
-        <w:rPr>
-          <w:lang w:val="en-HK"/>
-        </w:rPr>
-        <w:t xml:space="preserve">, </w:t>
-      </w:r>
-      <w:r>
-        <w:rPr>
-          <w:lang w:val="en-HK"/>
-        </w:rPr>
-        <w:t>classical statistical models</w:t>
-      </w:r>
-      <w:r>
-        <w:rPr>
-          <w:lang w:val="en-HK"/>
-        </w:rPr>
-        <w:t xml:space="preserve"> and other </w:t>
-      </w:r>
-      <w:r>
-        <w:rPr>
-          <w:lang w:val="en-HK"/>
-        </w:rPr>
-        <w:t>kinds of</w:t>
-      </w:r>
-      <w:r>
-        <w:rPr>
-          <w:lang w:val="en-HK"/>
-        </w:rPr>
-        <w:t xml:space="preserve"> deep learning </w:t>
-      </w:r>
-      <w:r>
-        <w:rPr>
-          <w:lang w:val="en-HK"/>
-        </w:rPr>
-        <w:t>models</w:t>
-      </w:r>
-      <w:r>
-        <w:rPr>
-          <w:lang w:val="en-HK"/>
-        </w:rPr>
-        <w:t xml:space="preserve"> </w:t>
-      </w:r>
-      <w:r>
-        <w:rPr>
-          <w:color w:val="EE0000"/>
-          <w:lang w:val="en-HK"/>
-        </w:rPr>
-        <w:t>(verify)</w:t>
-      </w:r>
-      <w:r>
-        <w:rPr>
-          <w:lang w:val="en-HK"/>
-        </w:rPr>
-        <w:t xml:space="preserve">. </w:t>
-      </w:r>
-      <w:r>
-        <w:rPr>
-          <w:lang w:val="en-HK"/>
-        </w:rPr>
-        <w:t xml:space="preserve"> Hence, t</w:t>
-      </w:r>
-      <w:r>
-        <w:rPr>
-          <w:lang w:val="en-HK"/>
-        </w:rPr>
-        <w:t xml:space="preserve">o </w:t>
-      </w:r>
-      <w:r>
-        <w:rPr>
-          <w:lang w:val="en-HK"/>
-        </w:rPr>
-        <w:t>cover this gap</w:t>
-      </w:r>
-      <w:r>
-        <w:rPr>
-          <w:lang w:val="en-HK"/>
-        </w:rPr>
-        <w:t>, we will benchmark it against established forecasting models:</w:t>
-      </w:r>
-    </w:p>
-    <w:p>
-      <w:pPr>
-        <w:pStyle w:val="BodyText"/>
-        <w:numPr>
-          <w:ilvl w:val="0"/>
-          <w:numId w:val="23"/>
-        </w:numPr>
-        <w:spacing w:before="0" w:after="0"/>
-        <w:ind w:rightChars="-116" w:right="-278"/>
-        <w:rPr>
-          <w:lang w:val="en-HK"/>
-        </w:rPr>
-      </w:pPr>
-      <w:r>
-        <w:rPr>
-          <w:b/>
-          <w:bCs/>
-          <w:lang w:val="en-HK"/>
-        </w:rPr>
-        <w:t>SARIMAX (Classical Statistical):</w:t>
-      </w:r>
-      <w:r>
-        <w:rPr>
-          <w:lang w:val="en-HK"/>
-        </w:rPr>
-        <w:t> Historically relied upon for its </w:t>
-      </w:r>
-      <w:r>
-        <w:rPr>
-          <w:b/>
-          <w:bCs/>
-          <w:lang w:val="en-HK"/>
-        </w:rPr>
-        <w:t>interpretable</w:t>
-      </w:r>
-      <w:r>
-        <w:rPr>
-          <w:lang w:val="en-HK"/>
-        </w:rPr>
-        <w:t xml:space="preserve"> and highly effective </w:t>
-      </w:r>
-      <w:r>
-        <w:rPr>
-          <w:lang w:val="en-HK"/>
-        </w:rPr>
-        <w:t>modelling</w:t>
-      </w:r>
-      <w:r>
-        <w:rPr>
-          <w:lang w:val="en-HK"/>
-        </w:rPr>
-        <w:t xml:space="preserve"> of trends and seasonality (Box et al., 2015). It allows for external explanatory variables (e.g., weather</w:t>
-      </w:r>
-      <w:r>
-        <w:rPr>
-          <w:lang w:val="en-HK"/>
-        </w:rPr>
-        <w:t>) but</w:t>
-      </w:r>
-      <w:r>
-        <w:rPr>
-          <w:lang w:val="en-HK"/>
-        </w:rPr>
-        <w:t xml:space="preserve"> inherently struggles with </w:t>
-      </w:r>
-      <w:r>
-        <w:rPr>
-          <w:b/>
-          <w:bCs/>
-          <w:lang w:val="en-HK"/>
-        </w:rPr>
-        <w:t>nonlinear</w:t>
-      </w:r>
-      <w:r>
-        <w:rPr>
-          <w:lang w:val="en-HK"/>
-        </w:rPr>
-        <w:t> relationships and long-range temporal dependencies.</w:t>
-      </w:r>
-    </w:p>
-    <w:p>
-      <w:pPr>
-        <w:pStyle w:val="BodyText"/>
-        <w:numPr>
-          <w:ilvl w:val="0"/>
-          <w:numId w:val="23"/>
-        </w:numPr>
-        <w:spacing w:before="0" w:after="0"/>
-        <w:ind w:rightChars="-116" w:right="-278"/>
-        <w:rPr>
-          <w:lang w:val="en-HK"/>
-        </w:rPr>
-      </w:pPr>
-      <w:r>
-        <w:rPr>
-          <w:b/>
-          <w:bCs/>
-          <w:lang w:val="en-HK"/>
-        </w:rPr>
-        <w:t>LSTM (</w:t>
-      </w:r>
-      <w:r>
-        <w:rPr>
-          <w:b/>
-          <w:bCs/>
-          <w:lang w:val="en-HK"/>
-        </w:rPr>
-        <w:t>Recurrent</w:t>
-      </w:r>
-      <w:r>
-        <w:rPr>
-          <w:b/>
-          <w:bCs/>
-          <w:lang w:val="en-HK"/>
-        </w:rPr>
-        <w:t xml:space="preserve"> Neural Network):</w:t>
-      </w:r>
-      <w:r>
-        <w:rPr>
-          <w:lang w:val="en-HK"/>
-        </w:rPr>
-        <w:t> Highly </w:t>
-      </w:r>
-      <w:r>
-        <w:rPr>
-          <w:b/>
-          <w:bCs/>
-          <w:lang w:val="en-HK"/>
-        </w:rPr>
-        <w:t>popular</w:t>
-      </w:r>
-      <w:r>
-        <w:rPr>
-          <w:lang w:val="en-HK"/>
-        </w:rPr>
-        <w:t xml:space="preserve"> for analyzing sequential data. Its gating mechanisms (Hochreiter &amp; Schmidhuber, 1997) retain information across longer intervals. However, </w:t>
-      </w:r>
-      <w:r>
-        <w:rPr>
-          <w:lang w:val="en-HK"/>
-        </w:rPr>
-        <w:t>it is</w:t>
-      </w:r>
-      <w:r>
-        <w:rPr>
-          <w:lang w:val="en-HK"/>
-        </w:rPr>
-        <w:t xml:space="preserve"> strictly sequential processing limits its ability to efficiently capture complex, long-range dependencies compared to transformers.</w:t>
       </w:r>
     </w:p>
     <w:p>
@@ -2269,6 +2444,7 @@
           <w:bCs/>
           <w:lang w:val="en-HK"/>
         </w:rPr>
+        <w:lastRenderedPageBreak/>
         <w:t>Training &amp; Robustness:</w:t>
       </w:r>
       <w:r>
@@ -2329,7 +2505,6 @@
           <w:bCs/>
           <w:lang w:val="en-HK"/>
         </w:rPr>
-        <w:lastRenderedPageBreak/>
         <w:t>Evaluation Metrics:</w:t>
       </w:r>
       <w:r>
@@ -2667,7 +2842,7 @@
           <w:noProof/>
         </w:rPr>
         <w:drawing>
-          <wp:inline distT="0" distB="0" distL="0" distR="0" wp14:anchorId="30ED272F" wp14:editId="0CBF1AE8">
+          <wp:inline distT="0" distB="0" distL="0" distR="0" wp14:anchorId="30ED272F" wp14:editId="1169CA4D">
             <wp:extent cx="5943600" cy="2628900"/>
             <wp:effectExtent l="19050" t="19050" r="19050" b="19050"/>
             <wp:docPr id="207323580" name="Picture 2"/>
@@ -3923,11 +4098,93 @@
           <w:numId w:val="20"/>
         </w:numPr>
         <w:spacing w:before="240"/>
+        <w:rPr>
+          <w:color w:val="EE0000"/>
+        </w:rPr>
+      </w:pPr>
+      <w:r>
+        <w:rPr>
+          <w:color w:val="EE0000"/>
+        </w:rPr>
+        <w:t>Kong, Xiangjie and Chen, Zhenghao and Liu, Weiyao and Ning, Kaili and Zhang, Lechao and Muhammad Marier, Syauqie and Liu, Yichen and Chen, Yuhao and Xia, Feng</w:t>
+      </w:r>
+      <w:r>
+        <w:rPr>
+          <w:color w:val="EE0000"/>
+        </w:rPr>
+        <w:t xml:space="preserve"> (2025). “</w:t>
+      </w:r>
+      <w:r>
+        <w:rPr>
+          <w:color w:val="EE0000"/>
+        </w:rPr>
+        <w:t>Deep learning for time series forecasting: a survey</w:t>
+      </w:r>
+      <w:r>
+        <w:rPr>
+          <w:color w:val="EE0000"/>
+        </w:rPr>
+        <w:t xml:space="preserve">.” </w:t>
+      </w:r>
+      <w:r>
+        <w:rPr>
+          <w:color w:val="EE0000"/>
+        </w:rPr>
+        <w:t>International Journal of Machine Learning and Cybernetics</w:t>
+      </w:r>
+      <w:r>
+        <w:rPr>
+          <w:color w:val="EE0000"/>
+        </w:rPr>
+        <w:t xml:space="preserve"> (pp. </w:t>
+      </w:r>
+      <w:r>
+        <w:rPr>
+          <w:color w:val="EE0000"/>
+        </w:rPr>
+        <w:t>5079–5112</w:t>
+      </w:r>
+      <w:r>
+        <w:rPr>
+          <w:color w:val="EE0000"/>
+        </w:rPr>
+        <w:t xml:space="preserve">). </w:t>
+      </w:r>
+      <w:r>
+        <w:rPr>
+          <w:color w:val="EE0000"/>
+        </w:rPr>
+        <w:t>Springer Science and Business Media LLC</w:t>
+      </w:r>
+      <w:r>
+        <w:rPr>
+          <w:color w:val="EE0000"/>
+        </w:rPr>
+        <w:t xml:space="preserve">. </w:t>
+      </w:r>
+      <w:hyperlink r:id="rId12" w:history="1">
+        <w:r>
+          <w:rPr>
+            <w:rStyle w:val="Hyperlink"/>
+            <w:color w:val="EE0000"/>
+          </w:rPr>
+          <w:t>https://arxiv.org/abs/2503.10198</w:t>
+        </w:r>
+      </w:hyperlink>
+    </w:p>
+    <w:p>
+      <w:pPr>
+        <w:pStyle w:val="Bibliography"/>
+        <w:numPr>
+          <w:ilvl w:val="0"/>
+          <w:numId w:val="20"/>
+        </w:numPr>
+        <w:spacing w:before="240"/>
       </w:pPr>
       <w:r>
         <w:t xml:space="preserve">Li, H., Shao, J., Liao, K., &amp; Tang, M. (2022). Do simpler statistical methods perform better in multivariate long sequence time-series forecasting? In Proceedings of the 31st ACM International Conference on Information &amp; Knowledge Management (pp. 4168–4172). Association for Computing Machinery. </w:t>
       </w:r>
-      <w:hyperlink r:id="rId12" w:history="1">
+      <w:hyperlink r:id="rId13" w:history="1">
         <w:r>
           <w:rPr>
             <w:rStyle w:val="Hyperlink"/>
@@ -3998,7 +4255,7 @@
       <w:r>
         <w:t>. </w:t>
       </w:r>
-      <w:hyperlink r:id="rId13" w:history="1">
+      <w:hyperlink r:id="rId14" w:history="1">
         <w:r>
           <w:rPr>
             <w:rStyle w:val="Hyperlink"/>
@@ -4019,7 +4276,7 @@
       <w:r>
         <w:t xml:space="preserve">Zeng, A., Chen, M., Zhang, L., &amp; Xu, Q. (2022). Are transformers effective for time series forecasting? arXiv. </w:t>
       </w:r>
-      <w:hyperlink r:id="rId14" w:history="1">
+      <w:hyperlink r:id="rId15" w:history="1">
         <w:r>
           <w:rPr>
             <w:rStyle w:val="Hyperlink"/>
@@ -4029,8 +4286,8 @@
       </w:hyperlink>
     </w:p>
     <w:sectPr>
-      <w:footerReference w:type="default" r:id="rId15"/>
-      <w:footerReference w:type="first" r:id="rId16"/>
+      <w:footerReference w:type="default" r:id="rId16"/>
+      <w:footerReference w:type="first" r:id="rId17"/>
       <w:pgSz w:w="12240" w:h="15840"/>
       <w:pgMar w:top="1440" w:right="1440" w:bottom="1440" w:left="1440" w:header="720" w:footer="96" w:gutter="0"/>
       <w:cols w:space="720"/>

</xml_diff>